<commit_message>
Added toy links and toy_info file
</commit_message>
<xml_diff>
--- a/Toy_Instructions/Sound_Movement_Light/Leapfrog_My_Pal_Scout_Violet/Leapfrog_My_Pal_Scout_Violet_Maker_Guide.docx
+++ b/Toy_Instructions/Sound_Movement_Light/Leapfrog_My_Pal_Scout_Violet/Leapfrog_My_Pal_Scout_Violet_Maker_Guide.docx
@@ -1,6 +1,6 @@
 
 <file path=word/document.xml><?xml version="1.0" encoding="utf-8"?>
-<w:document xmlns:wpc="http://schemas.microsoft.com/office/word/2010/wordprocessingCanvas" xmlns:cx="http://schemas.microsoft.com/office/drawing/2014/chartex" xmlns:cx1="http://schemas.microsoft.com/office/drawing/2015/9/8/chartex" xmlns:cx2="http://schemas.microsoft.com/office/drawing/2015/10/21/chartex" xmlns:cx3="http://schemas.microsoft.com/office/drawing/2016/5/9/chartex" xmlns:cx4="http://schemas.microsoft.com/office/drawing/2016/5/10/chartex" xmlns:cx5="http://schemas.microsoft.com/office/drawing/2016/5/11/chartex" xmlns:cx6="http://schemas.microsoft.com/office/drawing/2016/5/12/chartex" xmlns:cx7="http://schemas.microsoft.com/office/drawing/2016/5/13/chartex" xmlns:cx8="http://schemas.microsoft.com/office/drawing/2016/5/14/chartex" xmlns:mc="http://schemas.openxmlformats.org/markup-compatibility/2006" xmlns:aink="http://schemas.microsoft.com/office/drawing/2016/ink" xmlns:am3d="http://schemas.microsoft.com/office/drawing/2017/model3d" xmlns:o="urn:schemas-microsoft-com:office:office" xmlns:oel="http://schemas.microsoft.com/office/2019/extlst" xmlns:r="http://schemas.openxmlformats.org/officeDocument/2006/relationships" xmlns:m="http://schemas.openxmlformats.org/officeDocument/2006/math" xmlns:v="urn:schemas-microsoft-com:vml" xmlns:wp14="http://schemas.microsoft.com/office/word/2010/wordprocessingDrawing" xmlns:wp="http://schemas.openxmlformats.org/drawingml/2006/wordprocessingDrawing" xmlns:w10="urn:schemas-microsoft-com:office:word" xmlns:w="http://schemas.openxmlformats.org/wordprocessingml/2006/main" xmlns:w14="http://schemas.microsoft.com/office/word/2010/wordml" xmlns:w15="http://schemas.microsoft.com/office/word/2012/wordml" xmlns:w16cex="http://schemas.microsoft.com/office/word/2018/wordml/cex" xmlns:w16cid="http://schemas.microsoft.com/office/word/2016/wordml/cid" xmlns:w16="http://schemas.microsoft.com/office/word/2018/wordml" xmlns:w16du="http://schemas.microsoft.com/office/word/2023/wordml/word16du" xmlns:w16sdtdh="http://schemas.microsoft.com/office/word/2020/wordml/sdtdatahash" xmlns:w16sdtfl="http://schemas.microsoft.com/office/word/2024/wordml/sdtformatlock" xmlns:w16se="http://schemas.microsoft.com/office/word/2015/wordml/symex" xmlns:wpg="http://schemas.microsoft.com/office/word/2010/wordprocessingGroup" xmlns:wpi="http://schemas.microsoft.com/office/word/2010/wordprocessingInk" xmlns:wne="http://schemas.microsoft.com/office/word/2006/wordml" xmlns:wps="http://schemas.microsoft.com/office/word/2010/wordprocessingShape" mc:Ignorable="w14 w15 w16se w16cid w16 w16cex w16sdtdh w16sdtfl w16du wp14">
+<w:document xmlns:wpc="http://schemas.microsoft.com/office/word/2010/wordprocessingCanvas" xmlns:cx="http://schemas.microsoft.com/office/drawing/2014/chartex" xmlns:cx1="http://schemas.microsoft.com/office/drawing/2015/9/8/chartex" xmlns:cx2="http://schemas.microsoft.com/office/drawing/2015/10/21/chartex" xmlns:cx3="http://schemas.microsoft.com/office/drawing/2016/5/9/chartex" xmlns:cx4="http://schemas.microsoft.com/office/drawing/2016/5/10/chartex" xmlns:cx5="http://schemas.microsoft.com/office/drawing/2016/5/11/chartex" xmlns:cx6="http://schemas.microsoft.com/office/drawing/2016/5/12/chartex" xmlns:cx7="http://schemas.microsoft.com/office/drawing/2016/5/13/chartex" xmlns:cx8="http://schemas.microsoft.com/office/drawing/2016/5/14/chartex" xmlns:mc="http://schemas.openxmlformats.org/markup-compatibility/2006" xmlns:aink="http://schemas.microsoft.com/office/drawing/2016/ink" xmlns:am3d="http://schemas.microsoft.com/office/drawing/2017/model3d" xmlns:o="urn:schemas-microsoft-com:office:office" xmlns:oel="http://schemas.microsoft.com/office/2019/extlst" xmlns:r="http://schemas.openxmlformats.org/officeDocument/2006/relationships" xmlns:m="http://schemas.openxmlformats.org/officeDocument/2006/math" xmlns:v="urn:schemas-microsoft-com:vml" xmlns:wp14="http://schemas.microsoft.com/office/word/2010/wordprocessingDrawing" xmlns:wp="http://schemas.openxmlformats.org/drawingml/2006/wordprocessingDrawing" xmlns:w10="urn:schemas-microsoft-com:office:word" xmlns:w="http://schemas.openxmlformats.org/wordprocessingml/2006/main" xmlns:w14="http://schemas.microsoft.com/office/word/2010/wordml" xmlns:w15="http://schemas.microsoft.com/office/word/2012/wordml" xmlns:w16cei="http://schemas.microsoft.com/office/word/2026/wordml/cei" xmlns:w16cex="http://schemas.microsoft.com/office/word/2018/wordml/cex" xmlns:w16cid="http://schemas.microsoft.com/office/word/2016/wordml/cid" xmlns:w16="http://schemas.microsoft.com/office/word/2018/wordml" xmlns:w16du="http://schemas.microsoft.com/office/word/2023/wordml/word16du" xmlns:w16sdtdh="http://schemas.microsoft.com/office/word/2020/wordml/sdtdatahash" xmlns:w16sdtfl="http://schemas.microsoft.com/office/word/2024/wordml/sdtformatlock" xmlns:w16se="http://schemas.microsoft.com/office/word/2015/wordml/symex" xmlns:wpg="http://schemas.microsoft.com/office/word/2010/wordprocessingGroup" xmlns:wpi="http://schemas.microsoft.com/office/word/2010/wordprocessingInk" xmlns:wne="http://schemas.microsoft.com/office/word/2006/wordml" xmlns:wps="http://schemas.microsoft.com/office/word/2010/wordprocessingShape" mc:Ignorable="w14 w15 w16se w16cid w16 w16cex w16sdtdh w16sdtfl w16du wp14">
   <w:body>
     <w:p>
       <w:pPr>
@@ -300,6 +300,93 @@
               </w:rPr>
               <w:t xml:space="preserve">Leap Frog My Pal Scout or Violet </w:t>
             </w:r>
+            <w:r>
+              <w:rPr>
+                <w:lang w:val="en-US"/>
+              </w:rPr>
+              <w:t xml:space="preserve">Smarty Paws </w:t>
+            </w:r>
+            <w:r>
+              <w:rPr>
+                <w:lang w:val="en-US"/>
+              </w:rPr>
+              <w:t>(</w:t>
+            </w:r>
+            <w:hyperlink r:id="rId14" w:history="1">
+              <w:r>
+                <w:rPr>
+                  <w:rStyle w:val="Hyperlink"/>
+                  <w:lang w:val="en-US"/>
+                </w:rPr>
+                <w:t>Walmart Scout</w:t>
+              </w:r>
+            </w:hyperlink>
+            <w:r>
+              <w:rPr>
+                <w:lang w:val="en-US"/>
+              </w:rPr>
+              <w:t xml:space="preserve">, </w:t>
+            </w:r>
+            <w:hyperlink r:id="rId15" w:history="1">
+              <w:r>
+                <w:rPr>
+                  <w:rStyle w:val="Hyperlink"/>
+                  <w:lang w:val="en-US"/>
+                </w:rPr>
+                <w:t>Walmart Violet</w:t>
+              </w:r>
+            </w:hyperlink>
+            <w:r>
+              <w:rPr>
+                <w:lang w:val="en-US"/>
+              </w:rPr>
+              <w:t xml:space="preserve">, </w:t>
+            </w:r>
+            <w:hyperlink r:id="rId16" w:history="1">
+              <w:r>
+                <w:rPr>
+                  <w:rStyle w:val="Hyperlink"/>
+                  <w:lang w:val="en-US"/>
+                </w:rPr>
+                <w:t>Amazon Scout</w:t>
+              </w:r>
+            </w:hyperlink>
+            <w:r>
+              <w:rPr>
+                <w:lang w:val="en-US"/>
+              </w:rPr>
+              <w:t xml:space="preserve">, </w:t>
+            </w:r>
+            <w:hyperlink r:id="rId17" w:history="1">
+              <w:r>
+                <w:rPr>
+                  <w:rStyle w:val="Hyperlink"/>
+                  <w:lang w:val="en-US"/>
+                </w:rPr>
+                <w:t>Amazon Violet</w:t>
+              </w:r>
+            </w:hyperlink>
+            <w:r>
+              <w:rPr>
+                <w:lang w:val="en-US"/>
+              </w:rPr>
+              <w:t xml:space="preserve">, </w:t>
+            </w:r>
+            <w:hyperlink r:id="rId18" w:history="1">
+              <w:r>
+                <w:rPr>
+                  <w:rStyle w:val="Hyperlink"/>
+                  <w:lang w:val="en-US"/>
+                </w:rPr>
+                <w:t>Amazon Scout French</w:t>
+              </w:r>
+            </w:hyperlink>
+            <w:r>
+              <w:rPr>
+                <w:lang w:val="en-US"/>
+              </w:rPr>
+              <w:t>)</w:t>
+            </w:r>
           </w:p>
           <w:p>
             <w:pPr>
@@ -393,7 +480,21 @@
               <w:rPr>
                 <w:lang w:val="en-US"/>
               </w:rPr>
-              <w:t>#4 3/8’’ Screws (x2)</w:t>
+              <w:t>#4 3/</w:t>
+            </w:r>
+            <w:proofErr w:type="gramStart"/>
+            <w:r>
+              <w:rPr>
+                <w:lang w:val="en-US"/>
+              </w:rPr>
+              <w:t>8’’</w:t>
+            </w:r>
+            <w:proofErr w:type="gramEnd"/>
+            <w:r>
+              <w:rPr>
+                <w:lang w:val="en-US"/>
+              </w:rPr>
+              <w:t xml:space="preserve"> Screws (x2)</w:t>
             </w:r>
           </w:p>
           <w:p>
@@ -412,7 +513,7 @@
             <w:r>
               <w:t xml:space="preserve">Refer to the </w:t>
             </w:r>
-            <w:hyperlink r:id="rId14" w:history="1">
+            <w:hyperlink r:id="rId19" w:history="1">
               <w:r>
                 <w:rPr>
                   <w:rStyle w:val="Hyperlink"/>
@@ -474,7 +575,7 @@
                           <pic:cNvPicPr/>
                         </pic:nvPicPr>
                         <pic:blipFill rotWithShape="1">
-                          <a:blip r:embed="rId15" cstate="print">
+                          <a:blip r:embed="rId20" cstate="print">
                             <a:extLst>
                               <a:ext uri="{28A0092B-C50C-407E-A947-70E740481C1C}">
                                 <a14:useLocalDpi xmlns:a14="http://schemas.microsoft.com/office/drawing/2010/main" val="0"/>
@@ -542,7 +643,7 @@
                           <pic:cNvPicPr/>
                         </pic:nvPicPr>
                         <pic:blipFill rotWithShape="1">
-                          <a:blip r:embed="rId16" cstate="print">
+                          <a:blip r:embed="rId21" cstate="print">
                             <a:extLst>
                               <a:ext uri="{28A0092B-C50C-407E-A947-70E740481C1C}">
                                 <a14:useLocalDpi xmlns:a14="http://schemas.microsoft.com/office/drawing/2010/main" val="0"/>
@@ -628,7 +729,7 @@
                           </pic:cNvPicPr>
                         </pic:nvPicPr>
                         <pic:blipFill rotWithShape="1">
-                          <a:blip r:embed="rId17" cstate="print">
+                          <a:blip r:embed="rId22" cstate="print">
                             <a:extLst>
                               <a:ext uri="{28A0092B-C50C-407E-A947-70E740481C1C}">
                                 <a14:useLocalDpi xmlns:a14="http://schemas.microsoft.com/office/drawing/2010/main" val="0"/>
@@ -733,7 +834,7 @@
                           <pic:cNvPicPr/>
                         </pic:nvPicPr>
                         <pic:blipFill>
-                          <a:blip r:embed="rId18" cstate="print">
+                          <a:blip r:embed="rId23" cstate="print">
                             <a:extLst>
                               <a:ext uri="{28A0092B-C50C-407E-A947-70E740481C1C}">
                                 <a14:useLocalDpi xmlns:a14="http://schemas.microsoft.com/office/drawing/2010/main" val="0"/>
@@ -812,7 +913,7 @@
                           </pic:cNvPicPr>
                         </pic:nvPicPr>
                         <pic:blipFill rotWithShape="1">
-                          <a:blip r:embed="rId19" cstate="print">
+                          <a:blip r:embed="rId24" cstate="print">
                             <a:extLst>
                               <a:ext uri="{28A0092B-C50C-407E-A947-70E740481C1C}">
                                 <a14:useLocalDpi xmlns:a14="http://schemas.microsoft.com/office/drawing/2010/main" val="0"/>
@@ -965,12 +1066,8 @@
       <w:pPr>
         <w:pStyle w:val="Heading1"/>
       </w:pPr>
-    </w:p>
-    <w:p>
-      <w:pPr>
-        <w:pStyle w:val="Heading1"/>
-      </w:pPr>
       <w:r>
+        <w:lastRenderedPageBreak/>
         <w:t>Assembly Instructions</w:t>
       </w:r>
     </w:p>
@@ -1104,7 +1201,7 @@
                           </pic:cNvPicPr>
                         </pic:nvPicPr>
                         <pic:blipFill rotWithShape="1">
-                          <a:blip r:embed="rId20" cstate="print">
+                          <a:blip r:embed="rId25" cstate="print">
                             <a:extLst>
                               <a:ext uri="{28A0092B-C50C-407E-A947-70E740481C1C}">
                                 <a14:useLocalDpi xmlns:a14="http://schemas.microsoft.com/office/drawing/2010/main" val="0"/>
@@ -1274,7 +1371,7 @@
                           </pic:cNvPicPr>
                         </pic:nvPicPr>
                         <pic:blipFill rotWithShape="1">
-                          <a:blip r:embed="rId21" cstate="print">
+                          <a:blip r:embed="rId26" cstate="print">
                             <a:extLst>
                               <a:ext uri="{28A0092B-C50C-407E-A947-70E740481C1C}">
                                 <a14:useLocalDpi xmlns:a14="http://schemas.microsoft.com/office/drawing/2010/main" val="0"/>
@@ -1325,7 +1422,7 @@
                 <w:lang w:eastAsia="en-CA"/>
               </w:rPr>
               <w:drawing>
-                <wp:anchor distT="0" distB="0" distL="114300" distR="114300" simplePos="0" relativeHeight="251691023" behindDoc="0" locked="0" layoutInCell="1" allowOverlap="1" wp14:anchorId="5A3E9B5A" wp14:editId="1BE3EC05">
+                <wp:anchor distT="0" distB="0" distL="114300" distR="114300" simplePos="0" relativeHeight="251691023" behindDoc="0" locked="0" layoutInCell="1" allowOverlap="1" wp14:anchorId="5A3E9B5A" wp14:editId="15BE18FA">
                   <wp:simplePos x="0" y="0"/>
                   <wp:positionH relativeFrom="column">
                     <wp:posOffset>-10881</wp:posOffset>
@@ -1350,7 +1447,7 @@
                           </pic:cNvPicPr>
                         </pic:nvPicPr>
                         <pic:blipFill rotWithShape="1">
-                          <a:blip r:embed="rId22" cstate="print">
+                          <a:blip r:embed="rId27" cstate="print">
                             <a:extLst>
                               <a:ext uri="{28A0092B-C50C-407E-A947-70E740481C1C}">
                                 <a14:useLocalDpi xmlns:a14="http://schemas.microsoft.com/office/drawing/2010/main" val="0"/>
@@ -1585,7 +1682,7 @@
                                 </pic:cNvPicPr>
                               </pic:nvPicPr>
                               <pic:blipFill rotWithShape="1">
-                                <a:blip r:embed="rId23" cstate="print">
+                                <a:blip r:embed="rId28" cstate="print">
                                   <a:extLst>
                                     <a:ext uri="{28A0092B-C50C-407E-A947-70E740481C1C}">
                                       <a14:useLocalDpi xmlns:a14="http://schemas.microsoft.com/office/drawing/2010/main" val="0"/>
@@ -1687,7 +1784,7 @@
                       </v:shapetype>
                       <v:shape id="Picture 1" o:spid="_x0000_s1027" type="#_x0000_t75" style="position:absolute;width:24701;height:15906;visibility:visible;mso-wrap-style:square" o:gfxdata="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" strokeweight="3pt">
                         <v:stroke endcap="square"/>
-                        <v:imagedata r:id="rId24" o:title="" cropbottom="7309f" cropleft="8592f" cropright="2764f"/>
+                        <v:imagedata r:id="rId29" o:title="" cropbottom="7309f" cropleft="8592f" cropright="2764f"/>
                       </v:shape>
                       <v:oval id="Oval 1" o:spid="_x0000_s1028" style="position:absolute;left:8542;top:7169;width:6350;height:6349;visibility:visible;mso-wrap-style:square;v-text-anchor:middle" o:gfxdata="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" filled="f" strokecolor="#ef373e [3205]" strokeweight="1.5pt">
                         <v:stroke joinstyle="miter"/>
@@ -2206,7 +2303,7 @@
                           </pic:cNvPicPr>
                         </pic:nvPicPr>
                         <pic:blipFill rotWithShape="1">
-                          <a:blip r:embed="rId25" cstate="print">
+                          <a:blip r:embed="rId30" cstate="print">
                             <a:extLst>
                               <a:ext uri="{28A0092B-C50C-407E-A947-70E740481C1C}">
                                 <a14:useLocalDpi xmlns:a14="http://schemas.microsoft.com/office/drawing/2010/main" val="0"/>
@@ -2267,7 +2364,7 @@
                           </pic:cNvPicPr>
                         </pic:nvPicPr>
                         <pic:blipFill rotWithShape="1">
-                          <a:blip r:embed="rId26" cstate="print">
+                          <a:blip r:embed="rId31" cstate="print">
                             <a:extLst>
                               <a:ext uri="{28A0092B-C50C-407E-A947-70E740481C1C}">
                                 <a14:useLocalDpi xmlns:a14="http://schemas.microsoft.com/office/drawing/2010/main" val="0"/>
@@ -2541,7 +2638,7 @@
                           </pic:cNvPicPr>
                         </pic:nvPicPr>
                         <pic:blipFill rotWithShape="1">
-                          <a:blip r:embed="rId27" cstate="print">
+                          <a:blip r:embed="rId32" cstate="print">
                             <a:extLst>
                               <a:ext uri="{28A0092B-C50C-407E-A947-70E740481C1C}">
                                 <a14:useLocalDpi xmlns:a14="http://schemas.microsoft.com/office/drawing/2010/main" val="0"/>
@@ -2796,7 +2893,7 @@
                           </pic:cNvPicPr>
                         </pic:nvPicPr>
                         <pic:blipFill rotWithShape="1">
-                          <a:blip r:embed="rId28" cstate="print">
+                          <a:blip r:embed="rId33" cstate="print">
                             <a:extLst>
                               <a:ext uri="{28A0092B-C50C-407E-A947-70E740481C1C}">
                                 <a14:useLocalDpi xmlns:a14="http://schemas.microsoft.com/office/drawing/2010/main" val="0"/>
@@ -2962,7 +3059,7 @@
                           </pic:cNvPicPr>
                         </pic:nvPicPr>
                         <pic:blipFill rotWithShape="1">
-                          <a:blip r:embed="rId29" cstate="print">
+                          <a:blip r:embed="rId34" cstate="print">
                             <a:extLst>
                               <a:ext uri="{28A0092B-C50C-407E-A947-70E740481C1C}">
                                 <a14:useLocalDpi xmlns:a14="http://schemas.microsoft.com/office/drawing/2010/main" val="0"/>
@@ -3171,7 +3268,7 @@
                           </pic:cNvPicPr>
                         </pic:nvPicPr>
                         <pic:blipFill rotWithShape="1">
-                          <a:blip r:embed="rId30" cstate="print">
+                          <a:blip r:embed="rId35" cstate="print">
                             <a:extLst>
                               <a:ext uri="{28A0092B-C50C-407E-A947-70E740481C1C}">
                                 <a14:useLocalDpi xmlns:a14="http://schemas.microsoft.com/office/drawing/2010/main" val="0"/>
@@ -3525,7 +3622,7 @@
                           </pic:cNvPicPr>
                         </pic:nvPicPr>
                         <pic:blipFill rotWithShape="1">
-                          <a:blip r:embed="rId31" cstate="print">
+                          <a:blip r:embed="rId36" cstate="print">
                             <a:extLst>
                               <a:ext uri="{28A0092B-C50C-407E-A947-70E740481C1C}">
                                 <a14:useLocalDpi xmlns:a14="http://schemas.microsoft.com/office/drawing/2010/main" val="0"/>
@@ -3661,7 +3758,7 @@
                           </pic:cNvPicPr>
                         </pic:nvPicPr>
                         <pic:blipFill rotWithShape="1">
-                          <a:blip r:embed="rId32" cstate="print">
+                          <a:blip r:embed="rId37" cstate="print">
                             <a:extLst>
                               <a:ext uri="{28A0092B-C50C-407E-A947-70E740481C1C}">
                                 <a14:useLocalDpi xmlns:a14="http://schemas.microsoft.com/office/drawing/2010/main" val="0"/>
@@ -3948,7 +4045,7 @@
                           </pic:cNvPicPr>
                         </pic:nvPicPr>
                         <pic:blipFill>
-                          <a:blip r:embed="rId33" cstate="print">
+                          <a:blip r:embed="rId38" cstate="print">
                             <a:extLst>
                               <a:ext uri="{28A0092B-C50C-407E-A947-70E740481C1C}">
                                 <a14:useLocalDpi xmlns:a14="http://schemas.microsoft.com/office/drawing/2010/main" val="0"/>
@@ -4094,7 +4191,7 @@
                           </pic:cNvPicPr>
                         </pic:nvPicPr>
                         <pic:blipFill rotWithShape="1">
-                          <a:blip r:embed="rId34" cstate="print">
+                          <a:blip r:embed="rId39" cstate="print">
                             <a:extLst>
                               <a:ext uri="{28A0092B-C50C-407E-A947-70E740481C1C}">
                                 <a14:useLocalDpi xmlns:a14="http://schemas.microsoft.com/office/drawing/2010/main" val="0"/>
@@ -4233,7 +4330,7 @@
                           </pic:cNvPicPr>
                         </pic:nvPicPr>
                         <pic:blipFill rotWithShape="1">
-                          <a:blip r:embed="rId35" cstate="print">
+                          <a:blip r:embed="rId40" cstate="print">
                             <a:extLst>
                               <a:ext uri="{28A0092B-C50C-407E-A947-70E740481C1C}">
                                 <a14:useLocalDpi xmlns:a14="http://schemas.microsoft.com/office/drawing/2010/main" val="0"/>
@@ -4433,7 +4530,7 @@
                           </pic:cNvPicPr>
                         </pic:nvPicPr>
                         <pic:blipFill rotWithShape="1">
-                          <a:blip r:embed="rId36" cstate="print">
+                          <a:blip r:embed="rId41" cstate="print">
                             <a:extLst>
                               <a:ext uri="{28A0092B-C50C-407E-A947-70E740481C1C}">
                                 <a14:useLocalDpi xmlns:a14="http://schemas.microsoft.com/office/drawing/2010/main" val="0"/>
@@ -4482,8 +4579,8 @@
       </w:pPr>
     </w:p>
     <w:sectPr>
-      <w:headerReference w:type="default" r:id="rId37"/>
-      <w:footerReference w:type="default" r:id="rId38"/>
+      <w:headerReference w:type="default" r:id="rId42"/>
+      <w:footerReference w:type="default" r:id="rId43"/>
       <w:pgSz w:w="12240" w:h="15840"/>
       <w:pgMar w:top="1440" w:right="1440" w:bottom="1440" w:left="1440" w:header="720" w:footer="708" w:gutter="0"/>
       <w:cols w:space="708"/>
@@ -4494,7 +4591,7 @@
 </file>
 
 <file path=word/endnotes.xml><?xml version="1.0" encoding="utf-8"?>
-<w:endnotes xmlns:wpc="http://schemas.microsoft.com/office/word/2010/wordprocessingCanvas" xmlns:cx="http://schemas.microsoft.com/office/drawing/2014/chartex" xmlns:cx1="http://schemas.microsoft.com/office/drawing/2015/9/8/chartex" xmlns:cx2="http://schemas.microsoft.com/office/drawing/2015/10/21/chartex" xmlns:cx3="http://schemas.microsoft.com/office/drawing/2016/5/9/chartex" xmlns:cx4="http://schemas.microsoft.com/office/drawing/2016/5/10/chartex" xmlns:cx5="http://schemas.microsoft.com/office/drawing/2016/5/11/chartex" xmlns:cx6="http://schemas.microsoft.com/office/drawing/2016/5/12/chartex" xmlns:cx7="http://schemas.microsoft.com/office/drawing/2016/5/13/chartex" xmlns:cx8="http://schemas.microsoft.com/office/drawing/2016/5/14/chartex" xmlns:mc="http://schemas.openxmlformats.org/markup-compatibility/2006" xmlns:aink="http://schemas.microsoft.com/office/drawing/2016/ink" xmlns:am3d="http://schemas.microsoft.com/office/drawing/2017/model3d" xmlns:o="urn:schemas-microsoft-com:office:office" xmlns:oel="http://schemas.microsoft.com/office/2019/extlst" xmlns:r="http://schemas.openxmlformats.org/officeDocument/2006/relationships" xmlns:m="http://schemas.openxmlformats.org/officeDocument/2006/math" xmlns:v="urn:schemas-microsoft-com:vml" xmlns:wp14="http://schemas.microsoft.com/office/word/2010/wordprocessingDrawing" xmlns:wp="http://schemas.openxmlformats.org/drawingml/2006/wordprocessingDrawing" xmlns:w10="urn:schemas-microsoft-com:office:word" xmlns:w="http://schemas.openxmlformats.org/wordprocessingml/2006/main" xmlns:w14="http://schemas.microsoft.com/office/word/2010/wordml" xmlns:w15="http://schemas.microsoft.com/office/word/2012/wordml" xmlns:w16cex="http://schemas.microsoft.com/office/word/2018/wordml/cex" xmlns:w16cid="http://schemas.microsoft.com/office/word/2016/wordml/cid" xmlns:w16="http://schemas.microsoft.com/office/word/2018/wordml" xmlns:w16du="http://schemas.microsoft.com/office/word/2023/wordml/word16du" xmlns:w16sdtdh="http://schemas.microsoft.com/office/word/2020/wordml/sdtdatahash" xmlns:w16sdtfl="http://schemas.microsoft.com/office/word/2024/wordml/sdtformatlock" xmlns:w16se="http://schemas.microsoft.com/office/word/2015/wordml/symex" xmlns:wpg="http://schemas.microsoft.com/office/word/2010/wordprocessingGroup" xmlns:wpi="http://schemas.microsoft.com/office/word/2010/wordprocessingInk" xmlns:wne="http://schemas.microsoft.com/office/word/2006/wordml" xmlns:wps="http://schemas.microsoft.com/office/word/2010/wordprocessingShape" mc:Ignorable="w14 w15 w16se w16cid w16 w16cex w16sdtdh w16sdtfl w16du wp14">
+<w:endnotes xmlns:wpc="http://schemas.microsoft.com/office/word/2010/wordprocessingCanvas" xmlns:cx="http://schemas.microsoft.com/office/drawing/2014/chartex" xmlns:cx1="http://schemas.microsoft.com/office/drawing/2015/9/8/chartex" xmlns:cx2="http://schemas.microsoft.com/office/drawing/2015/10/21/chartex" xmlns:cx3="http://schemas.microsoft.com/office/drawing/2016/5/9/chartex" xmlns:cx4="http://schemas.microsoft.com/office/drawing/2016/5/10/chartex" xmlns:cx5="http://schemas.microsoft.com/office/drawing/2016/5/11/chartex" xmlns:cx6="http://schemas.microsoft.com/office/drawing/2016/5/12/chartex" xmlns:cx7="http://schemas.microsoft.com/office/drawing/2016/5/13/chartex" xmlns:cx8="http://schemas.microsoft.com/office/drawing/2016/5/14/chartex" xmlns:mc="http://schemas.openxmlformats.org/markup-compatibility/2006" xmlns:aink="http://schemas.microsoft.com/office/drawing/2016/ink" xmlns:am3d="http://schemas.microsoft.com/office/drawing/2017/model3d" xmlns:o="urn:schemas-microsoft-com:office:office" xmlns:oel="http://schemas.microsoft.com/office/2019/extlst" xmlns:r="http://schemas.openxmlformats.org/officeDocument/2006/relationships" xmlns:m="http://schemas.openxmlformats.org/officeDocument/2006/math" xmlns:v="urn:schemas-microsoft-com:vml" xmlns:wp14="http://schemas.microsoft.com/office/word/2010/wordprocessingDrawing" xmlns:wp="http://schemas.openxmlformats.org/drawingml/2006/wordprocessingDrawing" xmlns:w10="urn:schemas-microsoft-com:office:word" xmlns:w="http://schemas.openxmlformats.org/wordprocessingml/2006/main" xmlns:w14="http://schemas.microsoft.com/office/word/2010/wordml" xmlns:w15="http://schemas.microsoft.com/office/word/2012/wordml" xmlns:w16cei="http://schemas.microsoft.com/office/word/2026/wordml/cei" xmlns:w16cex="http://schemas.microsoft.com/office/word/2018/wordml/cex" xmlns:w16cid="http://schemas.microsoft.com/office/word/2016/wordml/cid" xmlns:w16="http://schemas.microsoft.com/office/word/2018/wordml" xmlns:w16du="http://schemas.microsoft.com/office/word/2023/wordml/word16du" xmlns:w16sdtdh="http://schemas.microsoft.com/office/word/2020/wordml/sdtdatahash" xmlns:w16sdtfl="http://schemas.microsoft.com/office/word/2024/wordml/sdtformatlock" xmlns:w16se="http://schemas.microsoft.com/office/word/2015/wordml/symex" xmlns:wpg="http://schemas.microsoft.com/office/word/2010/wordprocessingGroup" xmlns:wpi="http://schemas.microsoft.com/office/word/2010/wordprocessingInk" xmlns:wne="http://schemas.microsoft.com/office/word/2006/wordml" xmlns:wps="http://schemas.microsoft.com/office/word/2010/wordprocessingShape" mc:Ignorable="w14 w15 w16se w16cid w16 w16cex w16sdtdh w16sdtfl w16du wp14">
   <w:endnote w:type="separator" w:id="-1">
     <w:p>
       <w:pPr>
@@ -4526,7 +4623,7 @@
 </file>
 
 <file path=word/footer1.xml><?xml version="1.0" encoding="utf-8"?>
-<w:ftr xmlns:wpc="http://schemas.microsoft.com/office/word/2010/wordprocessingCanvas" xmlns:cx="http://schemas.microsoft.com/office/drawing/2014/chartex" xmlns:cx1="http://schemas.microsoft.com/office/drawing/2015/9/8/chartex" xmlns:cx2="http://schemas.microsoft.com/office/drawing/2015/10/21/chartex" xmlns:cx3="http://schemas.microsoft.com/office/drawing/2016/5/9/chartex" xmlns:cx4="http://schemas.microsoft.com/office/drawing/2016/5/10/chartex" xmlns:cx5="http://schemas.microsoft.com/office/drawing/2016/5/11/chartex" xmlns:cx6="http://schemas.microsoft.com/office/drawing/2016/5/12/chartex" xmlns:cx7="http://schemas.microsoft.com/office/drawing/2016/5/13/chartex" xmlns:cx8="http://schemas.microsoft.com/office/drawing/2016/5/14/chartex" xmlns:mc="http://schemas.openxmlformats.org/markup-compatibility/2006" xmlns:aink="http://schemas.microsoft.com/office/drawing/2016/ink" xmlns:am3d="http://schemas.microsoft.com/office/drawing/2017/model3d" xmlns:o="urn:schemas-microsoft-com:office:office" xmlns:oel="http://schemas.microsoft.com/office/2019/extlst" xmlns:r="http://schemas.openxmlformats.org/officeDocument/2006/relationships" xmlns:m="http://schemas.openxmlformats.org/officeDocument/2006/math" xmlns:v="urn:schemas-microsoft-com:vml" xmlns:wp14="http://schemas.microsoft.com/office/word/2010/wordprocessingDrawing" xmlns:wp="http://schemas.openxmlformats.org/drawingml/2006/wordprocessingDrawing" xmlns:w10="urn:schemas-microsoft-com:office:word" xmlns:w="http://schemas.openxmlformats.org/wordprocessingml/2006/main" xmlns:w14="http://schemas.microsoft.com/office/word/2010/wordml" xmlns:w15="http://schemas.microsoft.com/office/word/2012/wordml" xmlns:w16cex="http://schemas.microsoft.com/office/word/2018/wordml/cex" xmlns:w16cid="http://schemas.microsoft.com/office/word/2016/wordml/cid" xmlns:w16="http://schemas.microsoft.com/office/word/2018/wordml" xmlns:w16du="http://schemas.microsoft.com/office/word/2023/wordml/word16du" xmlns:w16sdtdh="http://schemas.microsoft.com/office/word/2020/wordml/sdtdatahash" xmlns:w16sdtfl="http://schemas.microsoft.com/office/word/2024/wordml/sdtformatlock" xmlns:w16se="http://schemas.microsoft.com/office/word/2015/wordml/symex" xmlns:wpg="http://schemas.microsoft.com/office/word/2010/wordprocessingGroup" xmlns:wpi="http://schemas.microsoft.com/office/word/2010/wordprocessingInk" xmlns:wne="http://schemas.microsoft.com/office/word/2006/wordml" xmlns:wps="http://schemas.microsoft.com/office/word/2010/wordprocessingShape" mc:Ignorable="w14 w15 w16se w16cid w16 w16cex w16sdtdh w16sdtfl w16du wp14">
+<w:ftr xmlns:wpc="http://schemas.microsoft.com/office/word/2010/wordprocessingCanvas" xmlns:cx="http://schemas.microsoft.com/office/drawing/2014/chartex" xmlns:cx1="http://schemas.microsoft.com/office/drawing/2015/9/8/chartex" xmlns:cx2="http://schemas.microsoft.com/office/drawing/2015/10/21/chartex" xmlns:cx3="http://schemas.microsoft.com/office/drawing/2016/5/9/chartex" xmlns:cx4="http://schemas.microsoft.com/office/drawing/2016/5/10/chartex" xmlns:cx5="http://schemas.microsoft.com/office/drawing/2016/5/11/chartex" xmlns:cx6="http://schemas.microsoft.com/office/drawing/2016/5/12/chartex" xmlns:cx7="http://schemas.microsoft.com/office/drawing/2016/5/13/chartex" xmlns:cx8="http://schemas.microsoft.com/office/drawing/2016/5/14/chartex" xmlns:mc="http://schemas.openxmlformats.org/markup-compatibility/2006" xmlns:aink="http://schemas.microsoft.com/office/drawing/2016/ink" xmlns:am3d="http://schemas.microsoft.com/office/drawing/2017/model3d" xmlns:o="urn:schemas-microsoft-com:office:office" xmlns:oel="http://schemas.microsoft.com/office/2019/extlst" xmlns:r="http://schemas.openxmlformats.org/officeDocument/2006/relationships" xmlns:m="http://schemas.openxmlformats.org/officeDocument/2006/math" xmlns:v="urn:schemas-microsoft-com:vml" xmlns:wp14="http://schemas.microsoft.com/office/word/2010/wordprocessingDrawing" xmlns:wp="http://schemas.openxmlformats.org/drawingml/2006/wordprocessingDrawing" xmlns:w10="urn:schemas-microsoft-com:office:word" xmlns:w="http://schemas.openxmlformats.org/wordprocessingml/2006/main" xmlns:w14="http://schemas.microsoft.com/office/word/2010/wordml" xmlns:w15="http://schemas.microsoft.com/office/word/2012/wordml" xmlns:w16cei="http://schemas.microsoft.com/office/word/2026/wordml/cei" xmlns:w16cex="http://schemas.microsoft.com/office/word/2018/wordml/cex" xmlns:w16cid="http://schemas.microsoft.com/office/word/2016/wordml/cid" xmlns:w16="http://schemas.microsoft.com/office/word/2018/wordml" xmlns:w16du="http://schemas.microsoft.com/office/word/2023/wordml/word16du" xmlns:w16sdtdh="http://schemas.microsoft.com/office/word/2020/wordml/sdtdatahash" xmlns:w16sdtfl="http://schemas.microsoft.com/office/word/2024/wordml/sdtformatlock" xmlns:w16se="http://schemas.microsoft.com/office/word/2015/wordml/symex" xmlns:wpg="http://schemas.microsoft.com/office/word/2010/wordprocessingGroup" xmlns:wpi="http://schemas.microsoft.com/office/word/2010/wordprocessingInk" xmlns:wne="http://schemas.microsoft.com/office/word/2006/wordml" xmlns:wps="http://schemas.microsoft.com/office/word/2010/wordprocessingShape" mc:Ignorable="w14 w15 w16se w16cid w16 w16cex w16sdtdh w16sdtfl w16du wp14">
   <w:p>
     <w:pPr>
       <w:pStyle w:val="Header"/>
@@ -4827,7 +4924,7 @@
 </file>
 
 <file path=word/footnotes.xml><?xml version="1.0" encoding="utf-8"?>
-<w:footnotes xmlns:wpc="http://schemas.microsoft.com/office/word/2010/wordprocessingCanvas" xmlns:cx="http://schemas.microsoft.com/office/drawing/2014/chartex" xmlns:cx1="http://schemas.microsoft.com/office/drawing/2015/9/8/chartex" xmlns:cx2="http://schemas.microsoft.com/office/drawing/2015/10/21/chartex" xmlns:cx3="http://schemas.microsoft.com/office/drawing/2016/5/9/chartex" xmlns:cx4="http://schemas.microsoft.com/office/drawing/2016/5/10/chartex" xmlns:cx5="http://schemas.microsoft.com/office/drawing/2016/5/11/chartex" xmlns:cx6="http://schemas.microsoft.com/office/drawing/2016/5/12/chartex" xmlns:cx7="http://schemas.microsoft.com/office/drawing/2016/5/13/chartex" xmlns:cx8="http://schemas.microsoft.com/office/drawing/2016/5/14/chartex" xmlns:mc="http://schemas.openxmlformats.org/markup-compatibility/2006" xmlns:aink="http://schemas.microsoft.com/office/drawing/2016/ink" xmlns:am3d="http://schemas.microsoft.com/office/drawing/2017/model3d" xmlns:o="urn:schemas-microsoft-com:office:office" xmlns:oel="http://schemas.microsoft.com/office/2019/extlst" xmlns:r="http://schemas.openxmlformats.org/officeDocument/2006/relationships" xmlns:m="http://schemas.openxmlformats.org/officeDocument/2006/math" xmlns:v="urn:schemas-microsoft-com:vml" xmlns:wp14="http://schemas.microsoft.com/office/word/2010/wordprocessingDrawing" xmlns:wp="http://schemas.openxmlformats.org/drawingml/2006/wordprocessingDrawing" xmlns:w10="urn:schemas-microsoft-com:office:word" xmlns:w="http://schemas.openxmlformats.org/wordprocessingml/2006/main" xmlns:w14="http://schemas.microsoft.com/office/word/2010/wordml" xmlns:w15="http://schemas.microsoft.com/office/word/2012/wordml" xmlns:w16cex="http://schemas.microsoft.com/office/word/2018/wordml/cex" xmlns:w16cid="http://schemas.microsoft.com/office/word/2016/wordml/cid" xmlns:w16="http://schemas.microsoft.com/office/word/2018/wordml" xmlns:w16du="http://schemas.microsoft.com/office/word/2023/wordml/word16du" xmlns:w16sdtdh="http://schemas.microsoft.com/office/word/2020/wordml/sdtdatahash" xmlns:w16sdtfl="http://schemas.microsoft.com/office/word/2024/wordml/sdtformatlock" xmlns:w16se="http://schemas.microsoft.com/office/word/2015/wordml/symex" xmlns:wpg="http://schemas.microsoft.com/office/word/2010/wordprocessingGroup" xmlns:wpi="http://schemas.microsoft.com/office/word/2010/wordprocessingInk" xmlns:wne="http://schemas.microsoft.com/office/word/2006/wordml" xmlns:wps="http://schemas.microsoft.com/office/word/2010/wordprocessingShape" mc:Ignorable="w14 w15 w16se w16cid w16 w16cex w16sdtdh w16sdtfl w16du wp14">
+<w:footnotes xmlns:wpc="http://schemas.microsoft.com/office/word/2010/wordprocessingCanvas" xmlns:cx="http://schemas.microsoft.com/office/drawing/2014/chartex" xmlns:cx1="http://schemas.microsoft.com/office/drawing/2015/9/8/chartex" xmlns:cx2="http://schemas.microsoft.com/office/drawing/2015/10/21/chartex" xmlns:cx3="http://schemas.microsoft.com/office/drawing/2016/5/9/chartex" xmlns:cx4="http://schemas.microsoft.com/office/drawing/2016/5/10/chartex" xmlns:cx5="http://schemas.microsoft.com/office/drawing/2016/5/11/chartex" xmlns:cx6="http://schemas.microsoft.com/office/drawing/2016/5/12/chartex" xmlns:cx7="http://schemas.microsoft.com/office/drawing/2016/5/13/chartex" xmlns:cx8="http://schemas.microsoft.com/office/drawing/2016/5/14/chartex" xmlns:mc="http://schemas.openxmlformats.org/markup-compatibility/2006" xmlns:aink="http://schemas.microsoft.com/office/drawing/2016/ink" xmlns:am3d="http://schemas.microsoft.com/office/drawing/2017/model3d" xmlns:o="urn:schemas-microsoft-com:office:office" xmlns:oel="http://schemas.microsoft.com/office/2019/extlst" xmlns:r="http://schemas.openxmlformats.org/officeDocument/2006/relationships" xmlns:m="http://schemas.openxmlformats.org/officeDocument/2006/math" xmlns:v="urn:schemas-microsoft-com:vml" xmlns:wp14="http://schemas.microsoft.com/office/word/2010/wordprocessingDrawing" xmlns:wp="http://schemas.openxmlformats.org/drawingml/2006/wordprocessingDrawing" xmlns:w10="urn:schemas-microsoft-com:office:word" xmlns:w="http://schemas.openxmlformats.org/wordprocessingml/2006/main" xmlns:w14="http://schemas.microsoft.com/office/word/2010/wordml" xmlns:w15="http://schemas.microsoft.com/office/word/2012/wordml" xmlns:w16cei="http://schemas.microsoft.com/office/word/2026/wordml/cei" xmlns:w16cex="http://schemas.microsoft.com/office/word/2018/wordml/cex" xmlns:w16cid="http://schemas.microsoft.com/office/word/2016/wordml/cid" xmlns:w16="http://schemas.microsoft.com/office/word/2018/wordml" xmlns:w16du="http://schemas.microsoft.com/office/word/2023/wordml/word16du" xmlns:w16sdtdh="http://schemas.microsoft.com/office/word/2020/wordml/sdtdatahash" xmlns:w16sdtfl="http://schemas.microsoft.com/office/word/2024/wordml/sdtformatlock" xmlns:w16se="http://schemas.microsoft.com/office/word/2015/wordml/symex" xmlns:wpg="http://schemas.microsoft.com/office/word/2010/wordprocessingGroup" xmlns:wpi="http://schemas.microsoft.com/office/word/2010/wordprocessingInk" xmlns:wne="http://schemas.microsoft.com/office/word/2006/wordml" xmlns:wps="http://schemas.microsoft.com/office/word/2010/wordprocessingShape" mc:Ignorable="w14 w15 w16se w16cid w16 w16cex w16sdtdh w16sdtfl w16du wp14">
   <w:footnote w:type="separator" w:id="-1">
     <w:p>
       <w:pPr>
@@ -4859,7 +4956,7 @@
 </file>
 
 <file path=word/header1.xml><?xml version="1.0" encoding="utf-8"?>
-<w:hdr xmlns:wpc="http://schemas.microsoft.com/office/word/2010/wordprocessingCanvas" xmlns:cx="http://schemas.microsoft.com/office/drawing/2014/chartex" xmlns:cx1="http://schemas.microsoft.com/office/drawing/2015/9/8/chartex" xmlns:cx2="http://schemas.microsoft.com/office/drawing/2015/10/21/chartex" xmlns:cx3="http://schemas.microsoft.com/office/drawing/2016/5/9/chartex" xmlns:cx4="http://schemas.microsoft.com/office/drawing/2016/5/10/chartex" xmlns:cx5="http://schemas.microsoft.com/office/drawing/2016/5/11/chartex" xmlns:cx6="http://schemas.microsoft.com/office/drawing/2016/5/12/chartex" xmlns:cx7="http://schemas.microsoft.com/office/drawing/2016/5/13/chartex" xmlns:cx8="http://schemas.microsoft.com/office/drawing/2016/5/14/chartex" xmlns:mc="http://schemas.openxmlformats.org/markup-compatibility/2006" xmlns:aink="http://schemas.microsoft.com/office/drawing/2016/ink" xmlns:am3d="http://schemas.microsoft.com/office/drawing/2017/model3d" xmlns:o="urn:schemas-microsoft-com:office:office" xmlns:oel="http://schemas.microsoft.com/office/2019/extlst" xmlns:r="http://schemas.openxmlformats.org/officeDocument/2006/relationships" xmlns:m="http://schemas.openxmlformats.org/officeDocument/2006/math" xmlns:v="urn:schemas-microsoft-com:vml" xmlns:wp14="http://schemas.microsoft.com/office/word/2010/wordprocessingDrawing" xmlns:wp="http://schemas.openxmlformats.org/drawingml/2006/wordprocessingDrawing" xmlns:w10="urn:schemas-microsoft-com:office:word" xmlns:w="http://schemas.openxmlformats.org/wordprocessingml/2006/main" xmlns:w14="http://schemas.microsoft.com/office/word/2010/wordml" xmlns:w15="http://schemas.microsoft.com/office/word/2012/wordml" xmlns:w16cex="http://schemas.microsoft.com/office/word/2018/wordml/cex" xmlns:w16cid="http://schemas.microsoft.com/office/word/2016/wordml/cid" xmlns:w16="http://schemas.microsoft.com/office/word/2018/wordml" xmlns:w16du="http://schemas.microsoft.com/office/word/2023/wordml/word16du" xmlns:w16sdtdh="http://schemas.microsoft.com/office/word/2020/wordml/sdtdatahash" xmlns:w16sdtfl="http://schemas.microsoft.com/office/word/2024/wordml/sdtformatlock" xmlns:w16se="http://schemas.microsoft.com/office/word/2015/wordml/symex" xmlns:wpg="http://schemas.microsoft.com/office/word/2010/wordprocessingGroup" xmlns:wpi="http://schemas.microsoft.com/office/word/2010/wordprocessingInk" xmlns:wne="http://schemas.microsoft.com/office/word/2006/wordml" xmlns:wps="http://schemas.microsoft.com/office/word/2010/wordprocessingShape" mc:Ignorable="w14 w15 w16se w16cid w16 w16cex w16sdtdh w16sdtfl w16du wp14">
+<w:hdr xmlns:wpc="http://schemas.microsoft.com/office/word/2010/wordprocessingCanvas" xmlns:cx="http://schemas.microsoft.com/office/drawing/2014/chartex" xmlns:cx1="http://schemas.microsoft.com/office/drawing/2015/9/8/chartex" xmlns:cx2="http://schemas.microsoft.com/office/drawing/2015/10/21/chartex" xmlns:cx3="http://schemas.microsoft.com/office/drawing/2016/5/9/chartex" xmlns:cx4="http://schemas.microsoft.com/office/drawing/2016/5/10/chartex" xmlns:cx5="http://schemas.microsoft.com/office/drawing/2016/5/11/chartex" xmlns:cx6="http://schemas.microsoft.com/office/drawing/2016/5/12/chartex" xmlns:cx7="http://schemas.microsoft.com/office/drawing/2016/5/13/chartex" xmlns:cx8="http://schemas.microsoft.com/office/drawing/2016/5/14/chartex" xmlns:mc="http://schemas.openxmlformats.org/markup-compatibility/2006" xmlns:aink="http://schemas.microsoft.com/office/drawing/2016/ink" xmlns:am3d="http://schemas.microsoft.com/office/drawing/2017/model3d" xmlns:o="urn:schemas-microsoft-com:office:office" xmlns:oel="http://schemas.microsoft.com/office/2019/extlst" xmlns:r="http://schemas.openxmlformats.org/officeDocument/2006/relationships" xmlns:m="http://schemas.openxmlformats.org/officeDocument/2006/math" xmlns:v="urn:schemas-microsoft-com:vml" xmlns:wp14="http://schemas.microsoft.com/office/word/2010/wordprocessingDrawing" xmlns:wp="http://schemas.openxmlformats.org/drawingml/2006/wordprocessingDrawing" xmlns:w10="urn:schemas-microsoft-com:office:word" xmlns:w="http://schemas.openxmlformats.org/wordprocessingml/2006/main" xmlns:w14="http://schemas.microsoft.com/office/word/2010/wordml" xmlns:w15="http://schemas.microsoft.com/office/word/2012/wordml" xmlns:w16cei="http://schemas.microsoft.com/office/word/2026/wordml/cei" xmlns:w16cex="http://schemas.microsoft.com/office/word/2018/wordml/cex" xmlns:w16cid="http://schemas.microsoft.com/office/word/2016/wordml/cid" xmlns:w16="http://schemas.microsoft.com/office/word/2018/wordml" xmlns:w16du="http://schemas.microsoft.com/office/word/2023/wordml/word16du" xmlns:w16sdtdh="http://schemas.microsoft.com/office/word/2020/wordml/sdtdatahash" xmlns:w16sdtfl="http://schemas.microsoft.com/office/word/2024/wordml/sdtformatlock" xmlns:w16se="http://schemas.microsoft.com/office/word/2015/wordml/symex" xmlns:wpg="http://schemas.microsoft.com/office/word/2010/wordprocessingGroup" xmlns:wpi="http://schemas.microsoft.com/office/word/2010/wordprocessingInk" xmlns:wne="http://schemas.microsoft.com/office/word/2006/wordml" xmlns:wps="http://schemas.microsoft.com/office/word/2010/wordprocessingShape" mc:Ignorable="w14 w15 w16se w16cid w16 w16cex w16sdtdh w16sdtfl w16du wp14">
   <w:p>
     <w:pPr>
       <w:spacing w:after="0" w:line="240" w:lineRule="auto"/>
@@ -5008,7 +5105,18 @@
         <w:sz w:val="16"/>
         <w:szCs w:val="16"/>
       </w:rPr>
-      <w:t>2025</w:t>
+      <w:t>202</w:t>
+    </w:r>
+    <w:r>
+      <w:rPr>
+        <w:rFonts w:ascii="Calibri" w:eastAsia="Calibri" w:hAnsi="Calibri" w:cs="Calibri"/>
+        <w:b/>
+        <w:bCs/>
+        <w:color w:val="646464"/>
+        <w:sz w:val="16"/>
+        <w:szCs w:val="16"/>
+      </w:rPr>
+      <w:t>6</w:t>
     </w:r>
   </w:p>
   <w:p>
@@ -5090,7 +5198,7 @@
 </file>
 
 <file path=word/numbering.xml><?xml version="1.0" encoding="utf-8"?>
-<w:numbering xmlns:wpc="http://schemas.microsoft.com/office/word/2010/wordprocessingCanvas" xmlns:cx="http://schemas.microsoft.com/office/drawing/2014/chartex" xmlns:cx1="http://schemas.microsoft.com/office/drawing/2015/9/8/chartex" xmlns:cx2="http://schemas.microsoft.com/office/drawing/2015/10/21/chartex" xmlns:cx3="http://schemas.microsoft.com/office/drawing/2016/5/9/chartex" xmlns:cx4="http://schemas.microsoft.com/office/drawing/2016/5/10/chartex" xmlns:cx5="http://schemas.microsoft.com/office/drawing/2016/5/11/chartex" xmlns:cx6="http://schemas.microsoft.com/office/drawing/2016/5/12/chartex" xmlns:cx7="http://schemas.microsoft.com/office/drawing/2016/5/13/chartex" xmlns:cx8="http://schemas.microsoft.com/office/drawing/2016/5/14/chartex" xmlns:mc="http://schemas.openxmlformats.org/markup-compatibility/2006" xmlns:aink="http://schemas.microsoft.com/office/drawing/2016/ink" xmlns:am3d="http://schemas.microsoft.com/office/drawing/2017/model3d" xmlns:o="urn:schemas-microsoft-com:office:office" xmlns:oel="http://schemas.microsoft.com/office/2019/extlst" xmlns:r="http://schemas.openxmlformats.org/officeDocument/2006/relationships" xmlns:m="http://schemas.openxmlformats.org/officeDocument/2006/math" xmlns:v="urn:schemas-microsoft-com:vml" xmlns:wp14="http://schemas.microsoft.com/office/word/2010/wordprocessingDrawing" xmlns:wp="http://schemas.openxmlformats.org/drawingml/2006/wordprocessingDrawing" xmlns:w10="urn:schemas-microsoft-com:office:word" xmlns:w="http://schemas.openxmlformats.org/wordprocessingml/2006/main" xmlns:w14="http://schemas.microsoft.com/office/word/2010/wordml" xmlns:w15="http://schemas.microsoft.com/office/word/2012/wordml" xmlns:w16cex="http://schemas.microsoft.com/office/word/2018/wordml/cex" xmlns:w16cid="http://schemas.microsoft.com/office/word/2016/wordml/cid" xmlns:w16="http://schemas.microsoft.com/office/word/2018/wordml" xmlns:w16du="http://schemas.microsoft.com/office/word/2023/wordml/word16du" xmlns:w16sdtdh="http://schemas.microsoft.com/office/word/2020/wordml/sdtdatahash" xmlns:w16sdtfl="http://schemas.microsoft.com/office/word/2024/wordml/sdtformatlock" xmlns:w16se="http://schemas.microsoft.com/office/word/2015/wordml/symex" xmlns:wpg="http://schemas.microsoft.com/office/word/2010/wordprocessingGroup" xmlns:wpi="http://schemas.microsoft.com/office/word/2010/wordprocessingInk" xmlns:wne="http://schemas.microsoft.com/office/word/2006/wordml" xmlns:wps="http://schemas.microsoft.com/office/word/2010/wordprocessingShape" mc:Ignorable="w14 w15 w16se w16cid w16 w16cex w16sdtdh w16sdtfl w16du wp14">
+<w:numbering xmlns:wpc="http://schemas.microsoft.com/office/word/2010/wordprocessingCanvas" xmlns:cx="http://schemas.microsoft.com/office/drawing/2014/chartex" xmlns:cx1="http://schemas.microsoft.com/office/drawing/2015/9/8/chartex" xmlns:cx2="http://schemas.microsoft.com/office/drawing/2015/10/21/chartex" xmlns:cx3="http://schemas.microsoft.com/office/drawing/2016/5/9/chartex" xmlns:cx4="http://schemas.microsoft.com/office/drawing/2016/5/10/chartex" xmlns:cx5="http://schemas.microsoft.com/office/drawing/2016/5/11/chartex" xmlns:cx6="http://schemas.microsoft.com/office/drawing/2016/5/12/chartex" xmlns:cx7="http://schemas.microsoft.com/office/drawing/2016/5/13/chartex" xmlns:cx8="http://schemas.microsoft.com/office/drawing/2016/5/14/chartex" xmlns:mc="http://schemas.openxmlformats.org/markup-compatibility/2006" xmlns:aink="http://schemas.microsoft.com/office/drawing/2016/ink" xmlns:am3d="http://schemas.microsoft.com/office/drawing/2017/model3d" xmlns:o="urn:schemas-microsoft-com:office:office" xmlns:oel="http://schemas.microsoft.com/office/2019/extlst" xmlns:r="http://schemas.openxmlformats.org/officeDocument/2006/relationships" xmlns:m="http://schemas.openxmlformats.org/officeDocument/2006/math" xmlns:v="urn:schemas-microsoft-com:vml" xmlns:wp14="http://schemas.microsoft.com/office/word/2010/wordprocessingDrawing" xmlns:wp="http://schemas.openxmlformats.org/drawingml/2006/wordprocessingDrawing" xmlns:w10="urn:schemas-microsoft-com:office:word" xmlns:w="http://schemas.openxmlformats.org/wordprocessingml/2006/main" xmlns:w14="http://schemas.microsoft.com/office/word/2010/wordml" xmlns:w15="http://schemas.microsoft.com/office/word/2012/wordml" xmlns:w16cei="http://schemas.microsoft.com/office/word/2026/wordml/cei" xmlns:w16cex="http://schemas.microsoft.com/office/word/2018/wordml/cex" xmlns:w16cid="http://schemas.microsoft.com/office/word/2016/wordml/cid" xmlns:w16="http://schemas.microsoft.com/office/word/2018/wordml" xmlns:w16du="http://schemas.microsoft.com/office/word/2023/wordml/word16du" xmlns:w16sdtdh="http://schemas.microsoft.com/office/word/2020/wordml/sdtdatahash" xmlns:w16sdtfl="http://schemas.microsoft.com/office/word/2024/wordml/sdtformatlock" xmlns:w16se="http://schemas.microsoft.com/office/word/2015/wordml/symex" xmlns:wpg="http://schemas.microsoft.com/office/word/2010/wordprocessingGroup" xmlns:wpi="http://schemas.microsoft.com/office/word/2010/wordprocessingInk" xmlns:wne="http://schemas.microsoft.com/office/word/2006/wordml" xmlns:wps="http://schemas.microsoft.com/office/word/2010/wordprocessingShape" mc:Ignorable="w14 w15 w16se w16cid w16 w16cex w16sdtdh w16sdtfl w16du wp14">
   <w:abstractNum w:abstractNumId="0" w15:restartNumberingAfterBreak="0">
     <w:nsid w:val="20D37456"/>
     <w:multiLevelType w:val="hybridMultilevel"/>
@@ -6007,7 +6115,7 @@
       <w:lvlText w:val="%1."/>
       <w:lvlJc w:val="left"/>
       <w:pPr>
-        <w:ind w:left="720" w:hanging="360"/>
+        <w:ind w:left="360" w:hanging="360"/>
       </w:pPr>
       <w:rPr>
         <w:rFonts w:hint="default"/>
@@ -6019,7 +6127,7 @@
       <w:lvlText w:val="%2."/>
       <w:lvlJc w:val="left"/>
       <w:pPr>
-        <w:ind w:left="1440" w:hanging="360"/>
+        <w:ind w:left="1080" w:hanging="360"/>
       </w:pPr>
     </w:lvl>
     <w:lvl w:ilvl="2" w:tplc="0409001B" w:tentative="1">
@@ -6028,7 +6136,7 @@
       <w:lvlText w:val="%3."/>
       <w:lvlJc w:val="right"/>
       <w:pPr>
-        <w:ind w:left="2160" w:hanging="180"/>
+        <w:ind w:left="1800" w:hanging="180"/>
       </w:pPr>
     </w:lvl>
     <w:lvl w:ilvl="3" w:tplc="0409000F" w:tentative="1">
@@ -6037,7 +6145,7 @@
       <w:lvlText w:val="%4."/>
       <w:lvlJc w:val="left"/>
       <w:pPr>
-        <w:ind w:left="2880" w:hanging="360"/>
+        <w:ind w:left="2520" w:hanging="360"/>
       </w:pPr>
     </w:lvl>
     <w:lvl w:ilvl="4" w:tplc="04090019" w:tentative="1">
@@ -6046,7 +6154,7 @@
       <w:lvlText w:val="%5."/>
       <w:lvlJc w:val="left"/>
       <w:pPr>
-        <w:ind w:left="3600" w:hanging="360"/>
+        <w:ind w:left="3240" w:hanging="360"/>
       </w:pPr>
     </w:lvl>
     <w:lvl w:ilvl="5" w:tplc="0409001B" w:tentative="1">
@@ -6055,7 +6163,7 @@
       <w:lvlText w:val="%6."/>
       <w:lvlJc w:val="right"/>
       <w:pPr>
-        <w:ind w:left="4320" w:hanging="180"/>
+        <w:ind w:left="3960" w:hanging="180"/>
       </w:pPr>
     </w:lvl>
     <w:lvl w:ilvl="6" w:tplc="0409000F" w:tentative="1">
@@ -6064,7 +6172,7 @@
       <w:lvlText w:val="%7."/>
       <w:lvlJc w:val="left"/>
       <w:pPr>
-        <w:ind w:left="5040" w:hanging="360"/>
+        <w:ind w:left="4680" w:hanging="360"/>
       </w:pPr>
     </w:lvl>
     <w:lvl w:ilvl="7" w:tplc="04090019" w:tentative="1">
@@ -6073,7 +6181,7 @@
       <w:lvlText w:val="%8."/>
       <w:lvlJc w:val="left"/>
       <w:pPr>
-        <w:ind w:left="5760" w:hanging="360"/>
+        <w:ind w:left="5400" w:hanging="360"/>
       </w:pPr>
     </w:lvl>
     <w:lvl w:ilvl="8" w:tplc="0409001B" w:tentative="1">
@@ -6082,7 +6190,7 @@
       <w:lvlText w:val="%9."/>
       <w:lvlJc w:val="right"/>
       <w:pPr>
-        <w:ind w:left="6480" w:hanging="180"/>
+        <w:ind w:left="6120" w:hanging="180"/>
       </w:pPr>
     </w:lvl>
   </w:abstractNum>
@@ -7476,6 +7584,18 @@
     <w:basedOn w:val="DefaultParagraphFont"/>
     <w:rsid w:val="003E2722"/>
   </w:style>
+  <w:style w:type="character" w:styleId="UnresolvedMention">
+    <w:name w:val="Unresolved Mention"/>
+    <w:basedOn w:val="DefaultParagraphFont"/>
+    <w:uiPriority w:val="99"/>
+    <w:semiHidden/>
+    <w:unhideWhenUsed/>
+    <w:rsid w:val="0086059D"/>
+    <w:rPr>
+      <w:color w:val="605E5C"/>
+      <w:shd w:val="clear" w:color="auto" w:fill="E1DFDD"/>
+    </w:rPr>
+  </w:style>
 </w:styles>
 </file>
 
@@ -7741,8 +7861,8 @@
 </file>
 
 <file path=customXml/item1.xml><?xml version="1.0" encoding="utf-8"?>
-<ct:contentTypeSchema xmlns:ct="http://schemas.microsoft.com/office/2006/metadata/contentType" xmlns:ma="http://schemas.microsoft.com/office/2006/metadata/properties/metaAttributes" ct:_="" ma:_="" ma:contentTypeName="Document" ma:contentTypeID="0x010100456CAEA290209545A9F8681F83603874" ma:contentTypeVersion="19" ma:contentTypeDescription="Create a new document." ma:contentTypeScope="" ma:versionID="4bf10bb897fc0ef406baa02b9d664253">
-  <xsd:schema xmlns:xsd="http://www.w3.org/2001/XMLSchema" xmlns:xs="http://www.w3.org/2001/XMLSchema" xmlns:p="http://schemas.microsoft.com/office/2006/metadata/properties" xmlns:ns2="8cf100d1-0775-4feb-8634-62999c4541bc" xmlns:ns3="38b325e6-602c-452a-8617-173bf47082c5" targetNamespace="http://schemas.microsoft.com/office/2006/metadata/properties" ma:root="true" ma:fieldsID="1c6be4edf2b996d6a6f54fa7c1dd8d7b" ns2:_="" ns3:_="">
+<ct:contentTypeSchema xmlns:ct="http://schemas.microsoft.com/office/2006/metadata/contentType" xmlns:ma="http://schemas.microsoft.com/office/2006/metadata/properties/metaAttributes" ct:_="" ma:_="" ma:contentTypeName="Document" ma:contentTypeID="0x010100456CAEA290209545A9F8681F83603874" ma:contentTypeVersion="19" ma:contentTypeDescription="Create a new document." ma:contentTypeScope="" ma:versionID="a5b95c81d0183cd265e4c0ae7d195efc">
+  <xsd:schema xmlns:xsd="http://www.w3.org/2001/XMLSchema" xmlns:xs="http://www.w3.org/2001/XMLSchema" xmlns:p="http://schemas.microsoft.com/office/2006/metadata/properties" xmlns:ns2="8cf100d1-0775-4feb-8634-62999c4541bc" xmlns:ns3="38b325e6-602c-452a-8617-173bf47082c5" targetNamespace="http://schemas.microsoft.com/office/2006/metadata/properties" ma:root="true" ma:fieldsID="39769bd7f15653c282ab5152dbadbd81" ns2:_="" ns3:_="">
     <xsd:import namespace="8cf100d1-0775-4feb-8634-62999c4541bc"/>
     <xsd:import namespace="38b325e6-602c-452a-8617-173bf47082c5"/>
     <xsd:element name="properties">
@@ -7996,14 +8116,7 @@
 </file>
 
 <file path=customXml/item2.xml><?xml version="1.0" encoding="utf-8"?>
-<p:properties xmlns:p="http://schemas.microsoft.com/office/2006/metadata/properties" xmlns:xsi="http://www.w3.org/2001/XMLSchema-instance" xmlns:pc="http://schemas.microsoft.com/office/infopath/2007/PartnerControls">
-  <documentManagement>
-    <TaxCatchAll xmlns="38b325e6-602c-452a-8617-173bf47082c5" xsi:nil="true"/>
-    <lcf76f155ced4ddcb4097134ff3c332f xmlns="8cf100d1-0775-4feb-8634-62999c4541bc">
-      <Terms xmlns="http://schemas.microsoft.com/office/infopath/2007/PartnerControls"/>
-    </lcf76f155ced4ddcb4097134ff3c332f>
-  </documentManagement>
-</p:properties>
+<b:Sources xmlns:b="http://schemas.openxmlformats.org/officeDocument/2006/bibliography" xmlns="http://schemas.openxmlformats.org/officeDocument/2006/bibliography" SelectedStyle="\APASixthEditionOfficeOnline.xsl" StyleName="APA" Version="6"/>
 </file>
 
 <file path=customXml/item3.xml><?xml version="1.0" encoding="utf-8"?>
@@ -8016,35 +8129,24 @@
 </file>
 
 <file path=customXml/item4.xml><?xml version="1.0" encoding="utf-8"?>
-<b:Sources xmlns:b="http://schemas.openxmlformats.org/officeDocument/2006/bibliography" xmlns="http://schemas.openxmlformats.org/officeDocument/2006/bibliography" SelectedStyle="\APASixthEditionOfficeOnline.xsl" StyleName="APA" Version="6"/>
+<p:properties xmlns:p="http://schemas.microsoft.com/office/2006/metadata/properties" xmlns:xsi="http://www.w3.org/2001/XMLSchema-instance" xmlns:pc="http://schemas.microsoft.com/office/infopath/2007/PartnerControls">
+  <documentManagement>
+    <TaxCatchAll xmlns="38b325e6-602c-452a-8617-173bf47082c5" xsi:nil="true"/>
+    <lcf76f155ced4ddcb4097134ff3c332f xmlns="8cf100d1-0775-4feb-8634-62999c4541bc">
+      <Terms xmlns="http://schemas.microsoft.com/office/infopath/2007/PartnerControls"/>
+    </lcf76f155ced4ddcb4097134ff3c332f>
+  </documentManagement>
+</p:properties>
 </file>
 
 <file path=customXml/itemProps1.xml><?xml version="1.0" encoding="utf-8"?>
-<ds:datastoreItem xmlns:ds="http://schemas.openxmlformats.org/officeDocument/2006/customXml" ds:itemID="{ABA0DE76-F4E6-4946-9471-91401789BC67}">
-  <ds:schemaRefs>
-    <ds:schemaRef ds:uri="http://schemas.microsoft.com/office/2006/metadata/contentType"/>
-    <ds:schemaRef ds:uri="http://schemas.microsoft.com/office/2006/metadata/properties/metaAttributes"/>
-    <ds:schemaRef ds:uri="http://www.w3.org/2001/XMLSchema"/>
-    <ds:schemaRef ds:uri="http://schemas.microsoft.com/office/2006/metadata/properties"/>
-    <ds:schemaRef ds:uri="8cf100d1-0775-4feb-8634-62999c4541bc"/>
-    <ds:schemaRef ds:uri="38b325e6-602c-452a-8617-173bf47082c5"/>
-    <ds:schemaRef ds:uri="http://schemas.microsoft.com/office/2006/documentManagement/types"/>
-    <ds:schemaRef ds:uri="http://schemas.microsoft.com/office/infopath/2007/PartnerControls"/>
-    <ds:schemaRef ds:uri="http://schemas.openxmlformats.org/package/2006/metadata/core-properties"/>
-    <ds:schemaRef ds:uri="http://purl.org/dc/elements/1.1/"/>
-    <ds:schemaRef ds:uri="http://purl.org/dc/terms/"/>
-    <ds:schemaRef ds:uri="http://schemas.microsoft.com/internal/obd"/>
-  </ds:schemaRefs>
-</ds:datastoreItem>
+<ds:datastoreItem xmlns:ds="http://schemas.openxmlformats.org/officeDocument/2006/customXml" ds:itemID="{9A4B12EC-63B2-4B22-8A7C-09703057EDB4}"/>
 </file>
 
 <file path=customXml/itemProps2.xml><?xml version="1.0" encoding="utf-8"?>
-<ds:datastoreItem xmlns:ds="http://schemas.openxmlformats.org/officeDocument/2006/customXml" ds:itemID="{3A085C18-819E-4466-9494-DD461C39C2B0}">
+<ds:datastoreItem xmlns:ds="http://schemas.openxmlformats.org/officeDocument/2006/customXml" ds:itemID="{C438ADBA-56D5-474C-BF2C-97C24DDF66BD}">
   <ds:schemaRefs>
-    <ds:schemaRef ds:uri="http://schemas.microsoft.com/office/2006/metadata/properties"/>
-    <ds:schemaRef ds:uri="http://schemas.microsoft.com/office/infopath/2007/PartnerControls"/>
-    <ds:schemaRef ds:uri="38b325e6-602c-452a-8617-173bf47082c5"/>
-    <ds:schemaRef ds:uri="8cf100d1-0775-4feb-8634-62999c4541bc"/>
+    <ds:schemaRef ds:uri="http://schemas.openxmlformats.org/officeDocument/2006/bibliography"/>
   </ds:schemaRefs>
 </ds:datastoreItem>
 </file>
@@ -8058,9 +8160,12 @@
 </file>
 
 <file path=customXml/itemProps4.xml><?xml version="1.0" encoding="utf-8"?>
-<ds:datastoreItem xmlns:ds="http://schemas.openxmlformats.org/officeDocument/2006/customXml" ds:itemID="{C438ADBA-56D5-474C-BF2C-97C24DDF66BD}">
+<ds:datastoreItem xmlns:ds="http://schemas.openxmlformats.org/officeDocument/2006/customXml" ds:itemID="{3A085C18-819E-4466-9494-DD461C39C2B0}">
   <ds:schemaRefs>
-    <ds:schemaRef ds:uri="http://schemas.openxmlformats.org/officeDocument/2006/bibliography"/>
+    <ds:schemaRef ds:uri="http://schemas.microsoft.com/office/2006/metadata/properties"/>
+    <ds:schemaRef ds:uri="http://schemas.microsoft.com/office/infopath/2007/PartnerControls"/>
+    <ds:schemaRef ds:uri="38b325e6-602c-452a-8617-173bf47082c5"/>
+    <ds:schemaRef ds:uri="8cf100d1-0775-4feb-8634-62999c4541bc"/>
   </ds:schemaRefs>
 </ds:datastoreItem>
 </file>
</xml_diff>